<commit_message>
docs: update adviser to Ellen F. Mangaoang, MIT and instructor to Shekiro R. Raposas — all builders, slides, letters, manuscript, guides
</commit_message>
<xml_diff>
--- a/docs/manuscript/output/Validator_Briefing_Letters.docx
+++ b/docs/manuscript/output/Validator_Briefing_Letters.docx
@@ -439,7 +439,7 @@
           <w:i w:val="0"/>
           <w:sz w:val="20"/>
         </w:rPr>
-        <w:t>Noted by: Janelli M. Mendez, DIT  (Capstone Adviser)</w:t>
+        <w:t>Noted by: Ellen F. Mangaoang, MIT  (Capstone Adviser)</w:t>
       </w:r>
     </w:p>
     <w:p>
@@ -990,7 +990,7 @@
           <w:i w:val="0"/>
           <w:sz w:val="20"/>
         </w:rPr>
-        <w:t>Noted by: Janelli M. Mendez, DIT  (Capstone Adviser)</w:t>
+        <w:t>Noted by: Ellen F. Mangaoang, MIT  (Capstone Adviser)</w:t>
       </w:r>
     </w:p>
     <w:p>

</xml_diff>